<commit_message>
Update CHANGELOG and documentation for CodexCLI v0.2.1 release
- Enhanced workflow preferences application during unfinished runs, preserving existing issue cursors and attempt history.
- Migrated unfinished Workflow Runs from v2 to v3 schema, ensuring compatibility and state preservation.
- Updated README and user guides to reflect version changes and new features.
- Improved Ctrl+C functionality for stopping operations and exiting the application.
- Adjusted installation scripts and verification processes for the new version.
- Clarified documentation regarding schema compatibility and user workflow defaults.

This release focuses on improving user experience and ensuring seamless transitions between workflow versions.
</commit_message>
<xml_diff>
--- a/docs/CodexCLI-User-Guide.docx
+++ b/docs/CodexCLI-User-Guide.docx
@@ -124,7 +124,7 @@
               <w:pStyle w:val="TableText"/>
             </w:pPr>
             <w:r>
-              <w:t>v0.1.0</w:t>
+              <w:t>v0.2.1</w:t>
             </w:r>
           </w:p>
         </w:tc>
@@ -152,7 +152,7 @@
               <w:pStyle w:val="TableText"/>
             </w:pPr>
             <w:r>
-              <w:t>1.1</w:t>
+              <w:t>1.2</w:t>
             </w:r>
           </w:p>
         </w:tc>
@@ -180,7 +180,7 @@
               <w:pStyle w:val="TableText"/>
             </w:pPr>
             <w:r>
-              <w:t>15 July 2026</w:t>
+              <w:t>27 July 2026</w:t>
             </w:r>
           </w:p>
         </w:tc>
@@ -195,36 +195,20 @@
               <w:pStyle w:val="TableText"/>
             </w:pPr>
             <w:r>
-              <w:t>Implementation baseline</w:t>
-            </w:r>
-          </w:p>
-        </w:tc>
-        <w:tc>
-          <w:tcPr>
-            <w:tcMar/>
-          </w:tcPr>
-          <w:p>
-            <w:pPr>
-              <w:pStyle w:val="TableText"/>
-            </w:pPr>
-            <w:r>
-              <w:rPr>
-                <w:rFonts w:ascii="Cascadia Mono" w:hAnsi="Cascadia Mono" w:eastAsia="Consolas"/>
-                <w:color w:val="17365D"/>
-                <w:shd w:val="clear" w:color="auto" w:fill="E8EEF3"/>
-              </w:rPr>
-              <w:t>origin/main</w:t>
-            </w:r>
-            <w:r>
-              <w:t xml:space="preserve"> at </w:t>
-            </w:r>
-            <w:r>
-              <w:rPr>
-                <w:rFonts w:ascii="Cascadia Mono" w:hAnsi="Cascadia Mono" w:eastAsia="Consolas"/>
-                <w:color w:val="17365D"/>
-                <w:shd w:val="clear" w:color="auto" w:fill="E8EEF3"/>
-              </w:rPr>
-              <w:t>3f56dbf</w:t>
+              <w:t>Release commit</w:t>
+            </w:r>
+          </w:p>
+        </w:tc>
+        <w:tc>
+          <w:tcPr>
+            <w:tcMar/>
+          </w:tcPr>
+          <w:p>
+            <w:pPr>
+              <w:pStyle w:val="TableText"/>
+            </w:pPr>
+            <w:r>
+              <w:t>PENDING</w:t>
             </w:r>
           </w:p>
         </w:tc>
@@ -240,7 +224,7 @@
         <w:pStyle w:val="Callout"/>
       </w:pPr>
       <w:r>
-        <w:t xml:space="preserve">Scope: This guide covers the installable </w:t>
+        <w:t xml:space="preserve">Scope: This guide covers only the separately installed </w:t>
       </w:r>
       <w:r>
         <w:rPr>
@@ -251,7 +235,7 @@
         <w:t>codexcli</w:t>
       </w:r>
       <w:r>
-        <w:t xml:space="preserve"> workflow application and the companion </w:t>
+        <w:t xml:space="preserve"> Textual application and the companion </w:t>
       </w:r>
       <w:r>
         <w:rPr>
@@ -262,7 +246,29 @@
         <w:t>codexcli-gate</w:t>
       </w:r>
       <w:r>
-        <w:t xml:space="preserve"> verification-evidence command. The older </w:t>
+        <w:t xml:space="preserve"> evidence command. </w:t>
+      </w:r>
+      <w:r>
+        <w:rPr>
+          <w:rFonts w:ascii="Cascadia Mono" w:hAnsi="Cascadia Mono" w:eastAsia="Consolas"/>
+          <w:color w:val="17365D"/>
+          <w:shd w:val="clear" w:color="auto" w:fill="E8EEF3"/>
+        </w:rPr>
+        <w:t>codexcli</w:t>
+      </w:r>
+      <w:r>
+        <w:t xml:space="preserve"> is not the backend, next version, or resume mechanism of the portable </w:t>
+      </w:r>
+      <w:r>
+        <w:rPr>
+          <w:rFonts w:ascii="Cascadia Mono" w:hAnsi="Cascadia Mono" w:eastAsia="Consolas"/>
+          <w:color w:val="17365D"/>
+          <w:shd w:val="clear" w:color="auto" w:fill="E8EEF3"/>
+        </w:rPr>
+        <w:t>devloop-plan</w:t>
+      </w:r>
+      <w:r>
+        <w:t xml:space="preserve"> and </w:t>
       </w:r>
       <w:r>
         <w:rPr>
@@ -273,18 +279,18 @@
         <w:t>devloop</w:t>
       </w:r>
       <w:r>
-        <w:t xml:space="preserve"> and </w:t>
-      </w:r>
-      <w:r>
-        <w:rPr>
-          <w:rFonts w:ascii="Cascadia Mono" w:hAnsi="Cascadia Mono" w:eastAsia="Consolas"/>
-          <w:color w:val="17365D"/>
-          <w:shd w:val="clear" w:color="auto" w:fill="E8EEF3"/>
-        </w:rPr>
-        <w:t>devloop-plan</w:t>
-      </w:r>
-      <w:r>
-        <w:t xml:space="preserve"> wrapper scripts have different parameters and are outside this guide.</w:t>
+        <w:t xml:space="preserve"> wrappers. Those wrappers have different commands, source modules, and PRD-local state. See </w:t>
+      </w:r>
+      <w:r>
+        <w:rPr>
+          <w:rFonts w:ascii="Cascadia Mono" w:hAnsi="Cascadia Mono" w:eastAsia="Consolas"/>
+          <w:color w:val="17365D"/>
+          <w:shd w:val="clear" w:color="auto" w:fill="E8EEF3"/>
+        </w:rPr>
+        <w:t>product-boundaries.md</w:t>
+      </w:r>
+      <w:r>
+        <w:t xml:space="preserve"> before making cross-product changes.</w:t>
       </w:r>
     </w:p>
     <w:p>
@@ -1520,7 +1526,7 @@
           <w:sz w:val="17"/>
           <w:szCs w:val="17"/>
         </w:rPr>
-        <w:t>uv tool install ./dist/devloop_codexcli-0.1.0-py3-none-any.whl</w:t>
+        <w:t>uv tool install ./dist/devloop_codexcli-0.2.1-py3-none-any.whl</w:t>
       </w:r>
       <w:r>
         <w:br/>
@@ -1534,7 +1540,7 @@
           <w:sz w:val="17"/>
           <w:szCs w:val="17"/>
         </w:rPr>
-        <w:t>pipx install ./dist/devloop_codexcli-0.1.0-py3-none-any.whl</w:t>
+        <w:t>pipx install ./dist/devloop_codexcli-0.2.1-py3-none-any.whl</w:t>
       </w:r>
     </w:p>
     <w:p>
@@ -3055,7 +3061,7 @@
         <w:pStyle w:val="Normal"/>
       </w:pPr>
       <w:r>
-        <w:t>Review the path, branch, and base commit in the UI before selecting a choice. In v0.1.0, the proposed worktree path must not already exist.</w:t>
+        <w:t>Review the path, branch, and base commit in the UI before selecting a choice. In v0.2.1, the proposed worktree path must not already exist.</w:t>
       </w:r>
     </w:p>
     <w:p>
@@ -3832,7 +3838,7 @@
         <w:keepNext/>
       </w:pPr>
       <w:r>
-        <w:t>7.3 Parameters not provided by v0.1.0</w:t>
+        <w:t>7.3 Parameters not provided by v0.2.1</w:t>
       </w:r>
     </w:p>
     <w:p>
@@ -3870,7 +3876,7 @@
         <w:pStyle w:val="Normal"/>
       </w:pPr>
       <w:r>
-        <w:t xml:space="preserve">The legacy </w:t>
+        <w:t xml:space="preserve">The portable </w:t>
       </w:r>
       <w:r>
         <w:rPr>
@@ -6234,7 +6240,7 @@
         <w:t>en</w:t>
       </w:r>
       <w:r>
-        <w:t>. The setting is session-local in v0.1.0, and machine identifiers remain stable English tokens. For predictable generated content, write the feature request and clarifications in the desired language as well.</w:t>
+        <w:t>. The setting is session-local in v0.2.1, and machine identifiers remain stable English tokens. For predictable generated content, write the feature request and clarifications in the desired language as well.</w:t>
       </w:r>
     </w:p>
     <w:p>
@@ -8218,7 +8224,7 @@
         <w:pStyle w:val="Normal"/>
       </w:pPr>
       <w:r>
-        <w:t>At completion, publish or integrate the workspace manually. Typical follow-up actions—commit, merge, push, pull request creation, branch deletion, and worktree removal—remain outside CodexCLI v0.1.0.</w:t>
+        <w:t>At completion, publish or integrate the workspace manually. Typical follow-up actions—commit, merge, push, pull request creation, branch deletion, and worktree removal—remain outside CodexCLI v0.2.1.</w:t>
       </w:r>
     </w:p>
     <w:p>
@@ -8506,7 +8512,7 @@
         </w:numPr>
       </w:pPr>
       <w:r>
-        <w:t>v0.1.0 has no purge command or advanced retention UI.</w:t>
+        <w:t>v0.2.1 has no purge command or advanced retention UI.</w:t>
       </w:r>
     </w:p>
     <w:p>
@@ -9355,7 +9361,7 @@
         <w:pStyle w:val="Normal"/>
       </w:pPr>
       <w:r>
-        <w:t xml:space="preserve">The main v0.1.0 user configuration file is </w:t>
+        <w:t xml:space="preserve">The main v0.2.1 user configuration file is </w:t>
       </w:r>
       <w:r>
         <w:rPr>
@@ -9908,7 +9914,7 @@
         <w:pStyle w:val="Normal"/>
       </w:pPr>
       <w:r>
-        <w:t>The v0.1.0 proposal requires a new path and branch. Remove or rename stale resources manually only after confirming they are no longer needed, or choose the current checkout.</w:t>
+        <w:t>The v0.2.1 proposal requires a new path and branch. Remove or rename stale resources manually only after confirming they are no longer needed, or choose the current checkout.</w:t>
       </w:r>
     </w:p>
     <w:p>
@@ -10353,7 +10359,7 @@
         </w:numPr>
       </w:pPr>
       <w:r>
-        <w:t>GitHub installation of Skills or Agent References is not available inside CodexCLI v0.1.0.</w:t>
+        <w:t>GitHub installation of Skills or Agent References is not available inside CodexCLI v0.2.1.</w:t>
       </w:r>
     </w:p>
     <w:p>
@@ -10491,7 +10497,7 @@
         <w:t>@</w:t>
       </w:r>
       <w:r>
-        <w:t xml:space="preserve"> file search and attachment commands are not part of the v0.1.0 user interface.</w:t>
+        <w:t xml:space="preserve"> file search and attachment commands are not part of the v0.2.1 user interface.</w:t>
       </w:r>
     </w:p>
     <w:p>
@@ -11230,7 +11236,7 @@
         <w:color w:val="5B6573"/>
         <w:sz w:val="16"/>
       </w:rPr>
-      <w:t xml:space="preserve">Dev Loop v0.1.0  |  Page </w:t>
+      <w:t xml:space="preserve">Dev Loop v0.2.1  |  Page </w:t>
     </w:r>
     <w:fldSimple w:instr=" PAGE ">
       <w:r>

</xml_diff>